<commit_message>
Add installation and quickstart guides, scripts, and data
Added installation guides for Windows and macOS, quickstart and baseline evaluation instructions, requirements files, evaluation scripts, data split results, and virtual environment setups for baseline and degradation workflows. Also included supporting scripts for degradation synthesis, YOLOv8 model, and updated README for data preparation. These additions provide comprehensive documentation and tooling for both baseline and degradation pipelines.
</commit_message>
<xml_diff>
--- a/Proposal.docx
+++ b/Proposal.docx
@@ -6775,60 +6775,115 @@
           </w:rPr>
           <w:t>https://github.com/IntelliSensing/UAV-VisLoc</w:t>
         </w:r>
+        <w:r>
+          <w:rPr>
+            <w:rStyle w:val="Hyperlink"/>
+            <w:rFonts w:ascii="Times New Roman" w:hAnsi="Times New Roman" w:cs="Times New Roman"/>
+            <w:lang w:val="en-US"/>
+          </w:rPr>
+          <w:t xml:space="preserve"> [9</w:t>
+        </w:r>
       </w:hyperlink>
       <w:r>
         <w:rPr>
           <w:rFonts w:ascii="Times New Roman" w:hAnsi="Times New Roman" w:cs="Times New Roman"/>
           <w:lang w:val="en-US"/>
         </w:rPr>
-        <w:t xml:space="preserve"> [9]</w:t>
-      </w:r>
-    </w:p>
-    <w:p>
-      <w:pPr>
-        <w:rPr>
-          <w:rFonts w:ascii="Times New Roman" w:hAnsi="Times New Roman" w:cs="Times New Roman"/>
-          <w:lang w:val="en-US"/>
-        </w:rPr>
-      </w:pPr>
-    </w:p>
-    <w:p>
-      <w:pPr>
-        <w:rPr>
-          <w:rFonts w:ascii="Times New Roman" w:hAnsi="Times New Roman" w:cs="Times New Roman"/>
-          <w:lang w:val="en-US"/>
-        </w:rPr>
-      </w:pPr>
-    </w:p>
-    <w:p>
-      <w:pPr>
-        <w:rPr>
-          <w:rFonts w:ascii="Times New Roman" w:hAnsi="Times New Roman" w:cs="Times New Roman"/>
-          <w:lang w:val="en-US"/>
-        </w:rPr>
-      </w:pPr>
-    </w:p>
-    <w:p>
-      <w:pPr>
-        <w:rPr>
-          <w:rFonts w:ascii="Times New Roman" w:hAnsi="Times New Roman" w:cs="Times New Roman"/>
-          <w:lang w:val="en-US"/>
-        </w:rPr>
-      </w:pPr>
-    </w:p>
-    <w:p>
-      <w:pPr>
-        <w:rPr>
-          <w:rFonts w:ascii="Times New Roman" w:hAnsi="Times New Roman" w:cs="Times New Roman"/>
-          <w:lang w:val="en-US"/>
-        </w:rPr>
-      </w:pPr>
-      <w:r>
-        <w:rPr>
-          <w:rFonts w:ascii="Times New Roman" w:hAnsi="Times New Roman" w:cs="Times New Roman"/>
-          <w:lang w:val="en-US"/>
-        </w:rPr>
-        <w:lastRenderedPageBreak/>
+        <w:t>]</w:t>
+      </w:r>
+    </w:p>
+    <w:p>
+      <w:pPr>
+        <w:rPr>
+          <w:rFonts w:ascii="Times New Roman" w:hAnsi="Times New Roman" w:cs="Times New Roman"/>
+        </w:rPr>
+      </w:pPr>
+      <w:r>
+        <w:rPr>
+          <w:rFonts w:ascii="Times New Roman" w:hAnsi="Times New Roman" w:cs="Times New Roman"/>
+        </w:rPr>
+        <w:t xml:space="preserve">Swiss Drone and </w:t>
+      </w:r>
+      <w:proofErr w:type="spellStart"/>
+      <w:r>
+        <w:rPr>
+          <w:rFonts w:ascii="Times New Roman" w:hAnsi="Times New Roman" w:cs="Times New Roman"/>
+        </w:rPr>
+        <w:t>Okutama</w:t>
+      </w:r>
+      <w:proofErr w:type="spellEnd"/>
+      <w:r>
+        <w:rPr>
+          <w:rFonts w:ascii="Times New Roman" w:hAnsi="Times New Roman" w:cs="Times New Roman"/>
+        </w:rPr>
+        <w:t xml:space="preserve"> Drone Datasets</w:t>
+      </w:r>
+      <w:r>
+        <w:rPr>
+          <w:rFonts w:ascii="Times New Roman" w:hAnsi="Times New Roman" w:cs="Times New Roman"/>
+        </w:rPr>
+        <w:t xml:space="preserve">: </w:t>
+      </w:r>
+      <w:hyperlink r:id="rId20" w:history="1">
+        <w:r>
+          <w:rPr>
+            <w:rStyle w:val="Hyperlink"/>
+            <w:rFonts w:ascii="Times New Roman" w:hAnsi="Times New Roman" w:cs="Times New Roman"/>
+          </w:rPr>
+          <w:t>https://www.kaggle.com/datasets/aletbm/swiss-drone-and-okutama-drone-datasets/data</w:t>
+        </w:r>
+      </w:hyperlink>
+      <w:r>
+        <w:rPr>
+          <w:rFonts w:ascii="Times New Roman" w:hAnsi="Times New Roman" w:cs="Times New Roman"/>
+        </w:rPr>
+        <w:t xml:space="preserve"> [10]</w:t>
+      </w:r>
+    </w:p>
+    <w:p>
+      <w:pPr>
+        <w:rPr>
+          <w:rFonts w:ascii="Times New Roman" w:hAnsi="Times New Roman" w:cs="Times New Roman"/>
+          <w:lang w:val="en-US"/>
+        </w:rPr>
+      </w:pPr>
+    </w:p>
+    <w:p>
+      <w:pPr>
+        <w:rPr>
+          <w:rFonts w:ascii="Times New Roman" w:hAnsi="Times New Roman" w:cs="Times New Roman"/>
+          <w:lang w:val="en-US"/>
+        </w:rPr>
+      </w:pPr>
+    </w:p>
+    <w:p>
+      <w:pPr>
+        <w:rPr>
+          <w:rFonts w:ascii="Times New Roman" w:hAnsi="Times New Roman" w:cs="Times New Roman"/>
+          <w:lang w:val="en-US"/>
+        </w:rPr>
+      </w:pPr>
+    </w:p>
+    <w:p>
+      <w:pPr>
+        <w:rPr>
+          <w:rFonts w:ascii="Times New Roman" w:hAnsi="Times New Roman" w:cs="Times New Roman"/>
+          <w:lang w:val="en-US"/>
+        </w:rPr>
+      </w:pPr>
+    </w:p>
+    <w:p>
+      <w:pPr>
+        <w:rPr>
+          <w:rFonts w:ascii="Times New Roman" w:hAnsi="Times New Roman" w:cs="Times New Roman"/>
+          <w:lang w:val="en-US"/>
+        </w:rPr>
+      </w:pPr>
+      <w:r>
+        <w:rPr>
+          <w:rFonts w:ascii="Times New Roman" w:hAnsi="Times New Roman" w:cs="Times New Roman"/>
+          <w:lang w:val="en-US"/>
+        </w:rPr>
         <w:t>Hardware:</w:t>
       </w:r>
     </w:p>
@@ -7159,7 +7214,7 @@
         </w:rPr>
         <w:t xml:space="preserve">Wang, X., Xie, L., Dong, C., &amp; Shan, Y. (2021). Real-ESRGAN: Training Real-World Blind Super-Resolution with Pure Synthetic Data. </w:t>
       </w:r>
-      <w:hyperlink r:id="rId20" w:history="1">
+      <w:hyperlink r:id="rId21" w:history="1">
         <w:r>
           <w:rPr>
             <w:rStyle w:val="Hyperlink"/>
@@ -7236,7 +7291,7 @@
         </w:rPr>
         <w:t xml:space="preserve">Xin Wang. (2007). Laplacian Operator-Based Edge Detectors. IEEE Transactions on Pattern Analysis and Machine Intelligence., 29(5), 886–890. </w:t>
       </w:r>
-      <w:hyperlink r:id="rId21" w:history="1">
+      <w:hyperlink r:id="rId22" w:history="1">
         <w:r>
           <w:rPr>
             <w:rStyle w:val="Hyperlink"/>
@@ -7292,7 +7347,7 @@
         </w:rPr>
         <w:t xml:space="preserve"> and ROI selection. In H. Yu &amp; J. Dong (Eds.), NINTH INTERNATIONAL CONFERENCE ON GRAPHIC AND IMAGE PROCESSING (ICGIP 2017) (No. 106154X; Vol. 10615). SPIE. </w:t>
       </w:r>
-      <w:hyperlink r:id="rId22" w:history="1">
+      <w:hyperlink r:id="rId23" w:history="1">
         <w:r>
           <w:rPr>
             <w:rStyle w:val="Hyperlink"/>
@@ -7364,7 +7419,7 @@
         </w:rPr>
         <w:t xml:space="preserve">[6] </w:t>
       </w:r>
-      <w:hyperlink r:id="rId23" w:history="1">
+      <w:hyperlink r:id="rId24" w:history="1">
         <w:r>
           <w:rPr>
             <w:rStyle w:val="Hyperlink"/>
@@ -7390,7 +7445,7 @@
         </w:rPr>
         <w:t xml:space="preserve">[7] </w:t>
       </w:r>
-      <w:hyperlink r:id="rId24" w:history="1">
+      <w:hyperlink r:id="rId25" w:history="1">
         <w:r>
           <w:rPr>
             <w:rStyle w:val="Hyperlink"/>
@@ -7423,7 +7478,7 @@
         </w:rPr>
         <w:t xml:space="preserve">[8] </w:t>
       </w:r>
-      <w:hyperlink r:id="rId25" w:history="1">
+      <w:hyperlink r:id="rId26" w:history="1">
         <w:r>
           <w:rPr>
             <w:rStyle w:val="Hyperlink"/>
@@ -7456,7 +7511,7 @@
         </w:rPr>
         <w:t xml:space="preserve">[9] </w:t>
       </w:r>
-      <w:hyperlink r:id="rId26" w:history="1">
+      <w:hyperlink r:id="rId27" w:history="1">
         <w:r>
           <w:rPr>
             <w:rStyle w:val="Hyperlink"/>
@@ -7474,9 +7529,42 @@
         <w:t xml:space="preserve"> </w:t>
       </w:r>
     </w:p>
+    <w:p>
+      <w:pPr>
+        <w:spacing w:line="360" w:lineRule="auto"/>
+        <w:rPr>
+          <w:rFonts w:ascii="Times New Roman" w:hAnsi="Times New Roman" w:cs="Times New Roman"/>
+          <w:lang w:val="en-US"/>
+        </w:rPr>
+      </w:pPr>
+      <w:r>
+        <w:rPr>
+          <w:rFonts w:ascii="Times New Roman" w:hAnsi="Times New Roman" w:cs="Times New Roman"/>
+          <w:lang w:val="en-US"/>
+        </w:rPr>
+        <w:t xml:space="preserve">[10] </w:t>
+      </w:r>
+      <w:hyperlink r:id="rId28" w:history="1">
+        <w:r>
+          <w:rPr>
+            <w:rStyle w:val="Hyperlink"/>
+            <w:rFonts w:ascii="Times New Roman" w:hAnsi="Times New Roman" w:cs="Times New Roman"/>
+            <w:lang w:val="en-US"/>
+          </w:rPr>
+          <w:t>https://www.kaggle.com/datasets/aletbm/swiss-drone-and-okutama-drone-datasets/data</w:t>
+        </w:r>
+      </w:hyperlink>
+      <w:r>
+        <w:rPr>
+          <w:rFonts w:ascii="Times New Roman" w:hAnsi="Times New Roman" w:cs="Times New Roman"/>
+          <w:lang w:val="en-US"/>
+        </w:rPr>
+        <w:t xml:space="preserve"> </w:t>
+      </w:r>
+    </w:p>
     <w:sectPr>
-      <w:headerReference w:type="even" r:id="rId27"/>
-      <w:headerReference w:type="default" r:id="rId28"/>
+      <w:headerReference w:type="even" r:id="rId29"/>
+      <w:headerReference w:type="default" r:id="rId30"/>
       <w:pgSz w:w="11906" w:h="16838"/>
       <w:pgMar w:top="1134" w:right="1134" w:bottom="1134" w:left="1418" w:header="708" w:footer="708" w:gutter="0"/>
       <w:pgNumType w:start="1"/>
@@ -9191,7 +9279,7 @@
 </file>
 
 <file path=customXml/itemProps1.xml><?xml version="1.0" encoding="utf-8"?>
-<ds:datastoreItem xmlns:ds="http://schemas.openxmlformats.org/officeDocument/2006/customXml" ds:itemID="{8FA3A5C0-36AC-5C4F-903A-882AF68F70C6}">
+<ds:datastoreItem xmlns:ds="http://schemas.openxmlformats.org/officeDocument/2006/customXml" ds:itemID="{C3E995DE-3D79-184F-9BCD-76B95133072A}">
   <ds:schemaRefs>
     <ds:schemaRef ds:uri="http://schemas.openxmlformats.org/officeDocument/2006/bibliography"/>
   </ds:schemaRefs>

</xml_diff>